<commit_message>
fixed number of further development section
</commit_message>
<xml_diff>
--- a/Michael Tesis_Group 2_ AI700-Spring-2026_Midway Report.docx
+++ b/Michael Tesis_Group 2_ AI700-Spring-2026_Midway Report.docx
@@ -5376,12 +5376,7 @@
       </w:r>
       <w:proofErr w:type="gramStart"/>
       <w:r>
-        <w:t>ph</w:t>
-      </w:r>
-      <w:bookmarkStart w:id="0" w:name="_GoBack"/>
-      <w:bookmarkEnd w:id="0"/>
-      <w:r>
-        <w:t>ases</w:t>
+        <w:t>phases</w:t>
       </w:r>
       <w:proofErr w:type="gramEnd"/>
       <w:r>
@@ -5439,23 +5434,29 @@
     <w:p>
       <w:pPr>
         <w:pStyle w:val="Heading1"/>
-        <w:numPr>
-          <w:ilvl w:val="0"/>
-          <w:numId w:val="6"/>
-        </w:numPr>
-        <w:ind w:left="414" w:hanging="270"/>
-        <w:rPr>
-          <w:sz w:val="20"/>
-          <w:szCs w:val="20"/>
-        </w:rPr>
-      </w:pPr>
-      <w:r>
-        <w:rPr>
-          <w:sz w:val="20"/>
-          <w:szCs w:val="20"/>
-        </w:rPr>
-        <w:t>FURTHER DEVELOPMENT</w:t>
-      </w:r>
+        <w:spacing w:before="0"/>
+        <w:ind w:left="144" w:firstLine="180"/>
+        <w:rPr>
+          <w:sz w:val="20"/>
+          <w:szCs w:val="20"/>
+        </w:rPr>
+      </w:pPr>
+      <w:r>
+        <w:rPr>
+          <w:sz w:val="20"/>
+          <w:szCs w:val="20"/>
+        </w:rPr>
+        <w:t>VI</w:t>
+      </w:r>
+      <w:r>
+        <w:rPr>
+          <w:sz w:val="20"/>
+          <w:szCs w:val="20"/>
+        </w:rPr>
+        <w:t>I. FURTHER DEVELOPMENT</w:t>
+      </w:r>
+      <w:bookmarkStart w:id="0" w:name="_GoBack"/>
+      <w:bookmarkEnd w:id="0"/>
     </w:p>
     <w:p>
       <w:pPr>
@@ -8618,7 +8619,7 @@
 </file>
 
 <file path=customXml/itemProps1.xml><?xml version="1.0" encoding="utf-8"?>
-<ds:datastoreItem xmlns:ds="http://schemas.openxmlformats.org/officeDocument/2006/customXml" ds:itemID="{D81057A2-D6EE-4734-B93D-36AACF7423A1}">
+<ds:datastoreItem xmlns:ds="http://schemas.openxmlformats.org/officeDocument/2006/customXml" ds:itemID="{50F66FC9-80BF-4E32-A6D8-6BB5FF150083}">
   <ds:schemaRefs>
     <ds:schemaRef ds:uri="http://schemas.openxmlformats.org/officeDocument/2006/bibliography"/>
   </ds:schemaRefs>

</xml_diff>